<commit_message>
Add job-radar.net to resume, documents, and knowledge files
Co-Authored-By: Claude Sonnet 4.6 <noreply@anthropic.com>
</commit_message>
<xml_diff>
--- a/frontend/public/Duane_Pinkerton_FDE.docx
+++ b/frontend/public/Duane_Pinkerton_FDE.docx
@@ -224,13 +224,7 @@
         <w:t>AI &amp; Emerging:</w:t>
       </w:r>
       <w:r>
-        <w:t xml:space="preserve"> Prompt engineering · Agentic workflows · LLM integration · MCP (Model Context Protocol) · n8n workflow</w:t>
-      </w:r>
-      <w:r>
-        <w:t xml:space="preserve"> </w:t>
-      </w:r>
-      <w:r>
-        <w:t>orchestration</w:t>
+        <w:t xml:space="preserve"> Prompt engineering · Agentic workflows · LLM integration · MCP (Model Context Protocol) · n8n workflow orchestration</w:t>
       </w:r>
     </w:p>
     <w:p>
@@ -320,7 +314,7 @@
         <w:spacing w:before="40" w:after="40"/>
       </w:pPr>
       <w:r>
-        <w:t>Two production sites running AI as a core runtime feature, with more in active development — hire-duane.org is one example</w:t>
+        <w:t>Two production sites running AI as a core runtime feature — hire-duane.org and job-radar.net — with more in active development</w:t>
       </w:r>
     </w:p>
     <w:p>

</xml_diff>